<commit_message>
Build 2026 semester schedules
- Update schedule parsing and lesson model handling
- Add generated teacher, group, and room schedules
</commit_message>
<xml_diff>
--- a/src/Features/Integration/data/2026_sem1/zi/01.09.26/Orar_An_I Lic.docx
+++ b/src/Features/Integration/data/2026_sem1/zi/01.09.26/Orar_An_I Lic.docx
@@ -7019,7 +7019,7 @@
                 <w:szCs w:val="32"/>
                 <w:lang w:val="it-IT"/>
               </w:rPr>
-              <w:t xml:space="preserve">S e c u r i t a t e a    </w:t>
+              <w:t xml:space="preserve">Securitatea </w:t>
             </w:r>
             <w:r>
               <w:rPr>
@@ -7035,7 +7035,7 @@
                 <w:szCs w:val="32"/>
                 <w:lang w:val="it-IT"/>
               </w:rPr>
-              <w:t xml:space="preserve"> i b e r n e t i c ă   (curs)</w:t>
+              <w:t xml:space="preserve">ibernetică (curs)</w:t>
             </w:r>
           </w:p>
           <w:p>
@@ -15950,7 +15950,7 @@
                 <w:szCs w:val="32"/>
                 <w:lang w:val="it-IT"/>
               </w:rPr>
-              <w:t xml:space="preserve">Securitatea  </w:t>
+              <w:t xml:space="preserve">Securitatea </w:t>
             </w:r>
             <w:r>
               <w:rPr>

</xml_diff>

<commit_message>
Import 2026 year one and two schedules
</commit_message>
<xml_diff>
--- a/src/Features/Integration/data/2026_sem1/zi/01.09.26/Orar_An_I Lic.docx
+++ b/src/Features/Integration/data/2026_sem1/zi/01.09.26/Orar_An_I Lic.docx
@@ -122,88 +122,99 @@
                 <w:b/>
                 <w:sz w:val="40"/>
               </w:rPr>
-              <w:t>01(</w:t>
-            </w:r>
-            <w:proofErr w:type="spellStart"/>
-            <w:r>
+              <w:t>01(ro)</w:t>
+            </w:r>
+          </w:p>
+        </w:tc>
+        <w:tc>
+          <w:tcPr>
+            <w:tcW w:w="2649" w:type="dxa"/>
+            <w:tcBorders>
+              <w:top w:val="single" w:sz="24" w:space="0" w:color="auto"/>
+              <w:left w:val="single" w:sz="4" w:space="0" w:color="auto"/>
+              <w:bottom w:val="single" w:sz="24" w:space="0" w:color="auto"/>
+              <w:right w:val="single" w:sz="4" w:space="0" w:color="auto"/>
+            </w:tcBorders>
+            <w:vAlign w:val="center"/>
+          </w:tcPr>
+          <w:p>
+            <w:pPr>
+              <w:ind w:left="-113" w:right="-113"/>
+              <w:jc w:val="center"/>
               <w:rPr>
                 <w:b/>
                 <w:sz w:val="40"/>
               </w:rPr>
-              <w:t>ro</w:t>
-            </w:r>
-            <w:proofErr w:type="spellEnd"/>
+            </w:pPr>
             <w:r>
               <w:rPr>
                 <w:b/>
                 <w:sz w:val="40"/>
               </w:rPr>
-              <w:t>)</w:t>
-            </w:r>
-          </w:p>
-        </w:tc>
-        <w:tc>
-          <w:tcPr>
-            <w:tcW w:w="2649" w:type="dxa"/>
-            <w:tcBorders>
-              <w:top w:val="single" w:sz="24" w:space="0" w:color="auto"/>
-              <w:left w:val="single" w:sz="4" w:space="0" w:color="auto"/>
-              <w:bottom w:val="single" w:sz="24" w:space="0" w:color="auto"/>
-              <w:right w:val="single" w:sz="4" w:space="0" w:color="auto"/>
-            </w:tcBorders>
-            <w:vAlign w:val="center"/>
-          </w:tcPr>
-          <w:p>
-            <w:pPr>
-              <w:ind w:left="-113" w:right="-113"/>
-              <w:jc w:val="center"/>
+              <w:t>I2</w:t>
+            </w:r>
+            <w:r>
               <w:rPr>
                 <w:b/>
                 <w:sz w:val="40"/>
               </w:rPr>
-            </w:pPr>
+              <w:t>6</w:t>
+            </w:r>
             <w:r>
               <w:rPr>
                 <w:b/>
                 <w:sz w:val="40"/>
               </w:rPr>
-              <w:t>I2</w:t>
-            </w:r>
-            <w:r>
+              <w:t>01(ro)</w:t>
+            </w:r>
+          </w:p>
+        </w:tc>
+        <w:tc>
+          <w:tcPr>
+            <w:tcW w:w="2649" w:type="dxa"/>
+            <w:tcBorders>
+              <w:top w:val="single" w:sz="24" w:space="0" w:color="auto"/>
+              <w:left w:val="single" w:sz="4" w:space="0" w:color="auto"/>
+              <w:bottom w:val="single" w:sz="24" w:space="0" w:color="auto"/>
+              <w:right w:val="single" w:sz="4" w:space="0" w:color="auto"/>
+            </w:tcBorders>
+            <w:vAlign w:val="center"/>
+          </w:tcPr>
+          <w:p>
+            <w:pPr>
+              <w:ind w:left="-113" w:right="-113"/>
+              <w:jc w:val="center"/>
               <w:rPr>
                 <w:b/>
                 <w:sz w:val="40"/>
               </w:rPr>
-              <w:t>6</w:t>
-            </w:r>
+            </w:pPr>
             <w:r>
               <w:rPr>
                 <w:b/>
                 <w:sz w:val="40"/>
               </w:rPr>
-              <w:t>01(</w:t>
-            </w:r>
-            <w:proofErr w:type="spellStart"/>
+              <w:t>IA2</w:t>
+            </w:r>
             <w:r>
               <w:rPr>
                 <w:b/>
                 <w:sz w:val="40"/>
               </w:rPr>
-              <w:t>ro</w:t>
-            </w:r>
-            <w:proofErr w:type="spellEnd"/>
+              <w:t>6</w:t>
+            </w:r>
             <w:r>
               <w:rPr>
                 <w:b/>
                 <w:sz w:val="40"/>
               </w:rPr>
-              <w:t>)</w:t>
-            </w:r>
-          </w:p>
-        </w:tc>
-        <w:tc>
-          <w:tcPr>
-            <w:tcW w:w="2649" w:type="dxa"/>
+              <w:t>01(ro)</w:t>
+            </w:r>
+          </w:p>
+        </w:tc>
+        <w:tc>
+          <w:tcPr>
+            <w:tcW w:w="2650" w:type="dxa"/>
             <w:tcBorders>
               <w:top w:val="single" w:sz="24" w:space="0" w:color="auto"/>
               <w:left w:val="single" w:sz="4" w:space="0" w:color="auto"/>
@@ -240,141 +251,50 @@
                 <w:b/>
                 <w:sz w:val="40"/>
               </w:rPr>
-              <w:t>01(</w:t>
-            </w:r>
-            <w:proofErr w:type="spellStart"/>
-            <w:r>
+              <w:t>02(ro)</w:t>
+            </w:r>
+          </w:p>
+        </w:tc>
+        <w:tc>
+          <w:tcPr>
+            <w:tcW w:w="2650" w:type="dxa"/>
+            <w:tcBorders>
+              <w:top w:val="single" w:sz="24" w:space="0" w:color="auto"/>
+              <w:left w:val="single" w:sz="4" w:space="0" w:color="auto"/>
+              <w:bottom w:val="single" w:sz="24" w:space="0" w:color="auto"/>
+              <w:right w:val="single" w:sz="4" w:space="0" w:color="auto"/>
+            </w:tcBorders>
+            <w:vAlign w:val="center"/>
+          </w:tcPr>
+          <w:p>
+            <w:pPr>
+              <w:ind w:left="-113" w:right="-113"/>
+              <w:jc w:val="center"/>
               <w:rPr>
                 <w:b/>
                 <w:sz w:val="40"/>
               </w:rPr>
-              <w:t>ro</w:t>
-            </w:r>
-            <w:proofErr w:type="spellEnd"/>
+            </w:pPr>
             <w:r>
               <w:rPr>
                 <w:b/>
                 <w:sz w:val="40"/>
               </w:rPr>
-              <w:t>)</w:t>
-            </w:r>
-          </w:p>
-        </w:tc>
-        <w:tc>
-          <w:tcPr>
-            <w:tcW w:w="2650" w:type="dxa"/>
-            <w:tcBorders>
-              <w:top w:val="single" w:sz="24" w:space="0" w:color="auto"/>
-              <w:left w:val="single" w:sz="4" w:space="0" w:color="auto"/>
-              <w:bottom w:val="single" w:sz="24" w:space="0" w:color="auto"/>
-              <w:right w:val="single" w:sz="4" w:space="0" w:color="auto"/>
-            </w:tcBorders>
-            <w:vAlign w:val="center"/>
-          </w:tcPr>
-          <w:p>
-            <w:pPr>
-              <w:ind w:left="-113" w:right="-113"/>
-              <w:jc w:val="center"/>
+              <w:t>DU-IA2</w:t>
+            </w:r>
+            <w:r>
               <w:rPr>
                 <w:b/>
                 <w:sz w:val="40"/>
               </w:rPr>
-            </w:pPr>
+              <w:t>6</w:t>
+            </w:r>
             <w:r>
               <w:rPr>
                 <w:b/>
                 <w:sz w:val="40"/>
               </w:rPr>
-              <w:t>IA2</w:t>
-            </w:r>
-            <w:r>
-              <w:rPr>
-                <w:b/>
-                <w:sz w:val="40"/>
-              </w:rPr>
-              <w:t>6</w:t>
-            </w:r>
-            <w:r>
-              <w:rPr>
-                <w:b/>
-                <w:sz w:val="40"/>
-              </w:rPr>
-              <w:t>02(</w:t>
-            </w:r>
-            <w:proofErr w:type="spellStart"/>
-            <w:r>
-              <w:rPr>
-                <w:b/>
-                <w:sz w:val="40"/>
-              </w:rPr>
-              <w:t>ro</w:t>
-            </w:r>
-            <w:proofErr w:type="spellEnd"/>
-            <w:r>
-              <w:rPr>
-                <w:b/>
-                <w:sz w:val="40"/>
-              </w:rPr>
-              <w:t>)</w:t>
-            </w:r>
-          </w:p>
-        </w:tc>
-        <w:tc>
-          <w:tcPr>
-            <w:tcW w:w="2650" w:type="dxa"/>
-            <w:tcBorders>
-              <w:top w:val="single" w:sz="24" w:space="0" w:color="auto"/>
-              <w:left w:val="single" w:sz="4" w:space="0" w:color="auto"/>
-              <w:bottom w:val="single" w:sz="24" w:space="0" w:color="auto"/>
-              <w:right w:val="single" w:sz="4" w:space="0" w:color="auto"/>
-            </w:tcBorders>
-            <w:vAlign w:val="center"/>
-          </w:tcPr>
-          <w:p>
-            <w:pPr>
-              <w:ind w:left="-113" w:right="-113"/>
-              <w:jc w:val="center"/>
-              <w:rPr>
-                <w:b/>
-                <w:sz w:val="40"/>
-              </w:rPr>
-            </w:pPr>
-            <w:r>
-              <w:rPr>
-                <w:b/>
-                <w:sz w:val="40"/>
-              </w:rPr>
-              <w:t>DU-IA2</w:t>
-            </w:r>
-            <w:r>
-              <w:rPr>
-                <w:b/>
-                <w:sz w:val="40"/>
-              </w:rPr>
-              <w:t>6</w:t>
-            </w:r>
-            <w:r>
-              <w:rPr>
-                <w:b/>
-                <w:sz w:val="40"/>
-              </w:rPr>
-              <w:t>01(</w:t>
-            </w:r>
-            <w:proofErr w:type="spellStart"/>
-            <w:r>
-              <w:rPr>
-                <w:b/>
-                <w:sz w:val="40"/>
-              </w:rPr>
-              <w:t>ro</w:t>
-            </w:r>
-            <w:proofErr w:type="spellEnd"/>
-            <w:r>
-              <w:rPr>
-                <w:b/>
-                <w:sz w:val="40"/>
-              </w:rPr>
-              <w:t>)</w:t>
+              <w:t>01(ro)</w:t>
             </w:r>
           </w:p>
         </w:tc>
@@ -412,7 +332,6 @@
                 <w:lang w:val="ro-RO"/>
               </w:rPr>
             </w:pPr>
-            <w:proofErr w:type="spellStart"/>
             <w:r>
               <w:rPr>
                 <w:b/>
@@ -420,7 +339,6 @@
               </w:rPr>
               <w:t>Luni</w:t>
             </w:r>
-            <w:proofErr w:type="spellEnd"/>
           </w:p>
         </w:tc>
         <w:tc>
@@ -1960,7 +1878,6 @@
                 <w:sz w:val="40"/>
               </w:rPr>
             </w:pPr>
-            <w:proofErr w:type="spellStart"/>
             <w:r>
               <w:rPr>
                 <w:b/>
@@ -1968,7 +1885,6 @@
               </w:rPr>
               <w:t>Marţi</w:t>
             </w:r>
-            <w:proofErr w:type="spellEnd"/>
           </w:p>
         </w:tc>
         <w:tc>
@@ -3158,13 +3074,8 @@
             <w:pPr>
               <w:jc w:val="center"/>
             </w:pPr>
-            <w:proofErr w:type="spellStart"/>
-            <w:r>
-              <w:t>V.Vișnevschi</w:t>
-            </w:r>
-            <w:proofErr w:type="spellEnd"/>
-            <w:r>
-              <w:t xml:space="preserve">  145a</w:t>
+            <w:r>
+              <w:t>V.Vișnevschi  145a</w:t>
             </w:r>
             <w:r>
               <w:t>/4</w:t>
@@ -3668,23 +3579,7 @@
                 <w:sz w:val="22"/>
                 <w:szCs w:val="22"/>
               </w:rPr>
-              <w:t xml:space="preserve">Sist.de </w:t>
-            </w:r>
-            <w:proofErr w:type="spellStart"/>
-            <w:r>
-              <w:rPr>
-                <w:sz w:val="22"/>
-                <w:szCs w:val="22"/>
-              </w:rPr>
-              <w:t>oper</w:t>
-            </w:r>
-            <w:proofErr w:type="spellEnd"/>
-            <w:r>
-              <w:rPr>
-                <w:sz w:val="22"/>
-                <w:szCs w:val="22"/>
-              </w:rPr>
-              <w:t>.</w:t>
+              <w:t>Sist.de oper.</w:t>
             </w:r>
             <w:r>
               <w:rPr>
@@ -3738,21 +3633,12 @@
                 <w:lang w:val="it-IT"/>
               </w:rPr>
             </w:pPr>
-            <w:proofErr w:type="spellStart"/>
-            <w:r>
-              <w:rPr>
-                <w:sz w:val="22"/>
-                <w:szCs w:val="22"/>
-              </w:rPr>
-              <w:t>G.Marin</w:t>
-            </w:r>
-            <w:proofErr w:type="spellEnd"/>
-            <w:r>
-              <w:rPr>
-                <w:sz w:val="22"/>
-                <w:szCs w:val="22"/>
-              </w:rPr>
-              <w:t xml:space="preserve">   326</w:t>
+            <w:r>
+              <w:rPr>
+                <w:sz w:val="22"/>
+                <w:szCs w:val="22"/>
+              </w:rPr>
+              <w:t>G.Marin   326</w:t>
             </w:r>
             <w:r>
               <w:rPr>
@@ -3849,7 +3735,6 @@
                 <w:sz w:val="40"/>
               </w:rPr>
             </w:pPr>
-            <w:proofErr w:type="spellStart"/>
             <w:r>
               <w:rPr>
                 <w:b/>
@@ -3857,7 +3742,6 @@
               </w:rPr>
               <w:t>Miercuri</w:t>
             </w:r>
-            <w:proofErr w:type="spellEnd"/>
           </w:p>
         </w:tc>
         <w:tc>
@@ -5043,23 +4927,7 @@
                 <w:sz w:val="22"/>
                 <w:szCs w:val="22"/>
               </w:rPr>
-              <w:t xml:space="preserve">Sist.de </w:t>
-            </w:r>
-            <w:proofErr w:type="spellStart"/>
-            <w:r>
-              <w:rPr>
-                <w:sz w:val="22"/>
-                <w:szCs w:val="22"/>
-              </w:rPr>
-              <w:t>oper</w:t>
-            </w:r>
-            <w:proofErr w:type="spellEnd"/>
-            <w:r>
-              <w:rPr>
-                <w:sz w:val="22"/>
-                <w:szCs w:val="22"/>
-              </w:rPr>
-              <w:t>.</w:t>
+              <w:t>Sist.de oper.</w:t>
             </w:r>
             <w:r>
               <w:rPr>
@@ -5073,23 +4941,7 @@
                 <w:sz w:val="22"/>
                 <w:szCs w:val="22"/>
               </w:rPr>
-              <w:t>(</w:t>
-            </w:r>
-            <w:proofErr w:type="spellStart"/>
-            <w:r>
-              <w:rPr>
-                <w:sz w:val="22"/>
-                <w:szCs w:val="22"/>
-              </w:rPr>
-              <w:t>lab,imp</w:t>
-            </w:r>
-            <w:proofErr w:type="spellEnd"/>
-            <w:r>
-              <w:rPr>
-                <w:sz w:val="22"/>
-                <w:szCs w:val="22"/>
-              </w:rPr>
-              <w:t>)</w:t>
+              <w:t>(lab,imp)</w:t>
             </w:r>
           </w:p>
           <w:p>
@@ -5115,21 +4967,12 @@
               </w:rPr>
               <w:t xml:space="preserve"> </w:t>
             </w:r>
-            <w:proofErr w:type="spellStart"/>
-            <w:r>
-              <w:rPr>
-                <w:sz w:val="22"/>
-                <w:szCs w:val="22"/>
-              </w:rPr>
-              <w:t>N.Lupu</w:t>
-            </w:r>
-            <w:proofErr w:type="spellEnd"/>
-            <w:r>
-              <w:rPr>
-                <w:sz w:val="22"/>
-                <w:szCs w:val="22"/>
-              </w:rPr>
-              <w:t xml:space="preserve">  218/4a</w:t>
+            <w:r>
+              <w:rPr>
+                <w:sz w:val="22"/>
+                <w:szCs w:val="22"/>
+              </w:rPr>
+              <w:t>N.Lupu  218/4a</w:t>
             </w:r>
           </w:p>
           <w:p>
@@ -6195,23 +6038,7 @@
                 <w:sz w:val="24"/>
                 <w:szCs w:val="24"/>
               </w:rPr>
-              <w:t xml:space="preserve">Sist.de </w:t>
-            </w:r>
-            <w:proofErr w:type="spellStart"/>
-            <w:r>
-              <w:rPr>
-                <w:sz w:val="24"/>
-                <w:szCs w:val="24"/>
-              </w:rPr>
-              <w:t>oper</w:t>
-            </w:r>
-            <w:proofErr w:type="spellEnd"/>
-            <w:r>
-              <w:rPr>
-                <w:sz w:val="24"/>
-                <w:szCs w:val="24"/>
-              </w:rPr>
-              <w:t>.</w:t>
+              <w:t>Sist.de oper.</w:t>
             </w:r>
             <w:r>
               <w:rPr>
@@ -6251,21 +6078,12 @@
               </w:rPr>
               <w:t xml:space="preserve"> </w:t>
             </w:r>
-            <w:proofErr w:type="spellStart"/>
-            <w:r>
-              <w:rPr>
-                <w:sz w:val="24"/>
-                <w:szCs w:val="24"/>
-              </w:rPr>
-              <w:t>N.Lupu</w:t>
-            </w:r>
-            <w:proofErr w:type="spellEnd"/>
-            <w:r>
-              <w:rPr>
-                <w:sz w:val="24"/>
-                <w:szCs w:val="24"/>
-              </w:rPr>
-              <w:t xml:space="preserve">  145a/4</w:t>
+            <w:r>
+              <w:rPr>
+                <w:sz w:val="24"/>
+                <w:szCs w:val="24"/>
+              </w:rPr>
+              <w:t>N.Lupu  145a/4</w:t>
             </w:r>
           </w:p>
         </w:tc>
@@ -6513,23 +6331,7 @@
                 <w:sz w:val="24"/>
                 <w:szCs w:val="24"/>
               </w:rPr>
-              <w:t xml:space="preserve">Sist.de </w:t>
-            </w:r>
-            <w:proofErr w:type="spellStart"/>
-            <w:r>
-              <w:rPr>
-                <w:sz w:val="24"/>
-                <w:szCs w:val="24"/>
-              </w:rPr>
-              <w:t>oper</w:t>
-            </w:r>
-            <w:proofErr w:type="spellEnd"/>
-            <w:r>
-              <w:rPr>
-                <w:sz w:val="24"/>
-                <w:szCs w:val="24"/>
-              </w:rPr>
-              <w:t>.</w:t>
+              <w:t>Sist.de oper.</w:t>
             </w:r>
             <w:r>
               <w:rPr>
@@ -6555,21 +6357,12 @@
                 <w:szCs w:val="24"/>
               </w:rPr>
             </w:pPr>
-            <w:proofErr w:type="spellStart"/>
-            <w:r>
-              <w:rPr>
-                <w:sz w:val="24"/>
-                <w:szCs w:val="24"/>
-              </w:rPr>
-              <w:t>N.Lupu</w:t>
-            </w:r>
-            <w:proofErr w:type="spellEnd"/>
-            <w:r>
-              <w:rPr>
-                <w:sz w:val="24"/>
-                <w:szCs w:val="24"/>
-              </w:rPr>
-              <w:t xml:space="preserve">  145a/4</w:t>
+            <w:r>
+              <w:rPr>
+                <w:sz w:val="24"/>
+                <w:szCs w:val="24"/>
+              </w:rPr>
+              <w:t>N.Lupu  145a/4</w:t>
             </w:r>
           </w:p>
         </w:tc>
@@ -6733,23 +6526,7 @@
                 <w:sz w:val="24"/>
                 <w:szCs w:val="24"/>
               </w:rPr>
-              <w:t xml:space="preserve">Sist.de </w:t>
-            </w:r>
-            <w:proofErr w:type="spellStart"/>
-            <w:r>
-              <w:rPr>
-                <w:sz w:val="24"/>
-                <w:szCs w:val="24"/>
-              </w:rPr>
-              <w:t>oper</w:t>
-            </w:r>
-            <w:proofErr w:type="spellEnd"/>
-            <w:r>
-              <w:rPr>
-                <w:sz w:val="24"/>
-                <w:szCs w:val="24"/>
-              </w:rPr>
-              <w:t>.</w:t>
+              <w:t>Sist.de oper.</w:t>
             </w:r>
             <w:r>
               <w:rPr>
@@ -6775,21 +6552,12 @@
                 <w:szCs w:val="24"/>
               </w:rPr>
             </w:pPr>
-            <w:proofErr w:type="spellStart"/>
-            <w:r>
-              <w:rPr>
-                <w:sz w:val="24"/>
-                <w:szCs w:val="24"/>
-              </w:rPr>
-              <w:t>G.Marin</w:t>
-            </w:r>
-            <w:proofErr w:type="spellEnd"/>
-            <w:r>
-              <w:rPr>
-                <w:sz w:val="24"/>
-                <w:szCs w:val="24"/>
-              </w:rPr>
-              <w:t xml:space="preserve">   326/4</w:t>
+            <w:r>
+              <w:rPr>
+                <w:sz w:val="24"/>
+                <w:szCs w:val="24"/>
+              </w:rPr>
+              <w:t>G.Marin   326/4</w:t>
             </w:r>
           </w:p>
         </w:tc>
@@ -6816,23 +6584,7 @@
                 <w:sz w:val="24"/>
                 <w:szCs w:val="24"/>
               </w:rPr>
-              <w:t xml:space="preserve">Sist.de </w:t>
-            </w:r>
-            <w:proofErr w:type="spellStart"/>
-            <w:r>
-              <w:rPr>
-                <w:sz w:val="24"/>
-                <w:szCs w:val="24"/>
-              </w:rPr>
-              <w:t>oper</w:t>
-            </w:r>
-            <w:proofErr w:type="spellEnd"/>
-            <w:r>
-              <w:rPr>
-                <w:sz w:val="24"/>
-                <w:szCs w:val="24"/>
-              </w:rPr>
-              <w:t>.</w:t>
+              <w:t>Sist.de oper.</w:t>
             </w:r>
             <w:r>
               <w:rPr>
@@ -6858,21 +6610,12 @@
                 <w:szCs w:val="24"/>
               </w:rPr>
             </w:pPr>
-            <w:proofErr w:type="spellStart"/>
-            <w:r>
-              <w:rPr>
-                <w:sz w:val="24"/>
-                <w:szCs w:val="24"/>
-              </w:rPr>
-              <w:t>E.Seiciuc</w:t>
-            </w:r>
-            <w:proofErr w:type="spellEnd"/>
-            <w:r>
-              <w:rPr>
-                <w:sz w:val="24"/>
-                <w:szCs w:val="24"/>
-              </w:rPr>
-              <w:t xml:space="preserve">   419/4</w:t>
+            <w:r>
+              <w:rPr>
+                <w:sz w:val="24"/>
+                <w:szCs w:val="24"/>
+              </w:rPr>
+              <w:t>E.Seiciuc   419/4</w:t>
             </w:r>
           </w:p>
         </w:tc>
@@ -7019,7 +6762,7 @@
                 <w:szCs w:val="32"/>
                 <w:lang w:val="it-IT"/>
               </w:rPr>
-              <w:t xml:space="preserve">Securitatea </w:t>
+              <w:t xml:space="preserve">S e c u r i t a t e a    </w:t>
             </w:r>
             <w:r>
               <w:rPr>
@@ -7035,7 +6778,7 @@
                 <w:szCs w:val="32"/>
                 <w:lang w:val="it-IT"/>
               </w:rPr>
-              <w:t xml:space="preserve">ibernetică (curs)</w:t>
+              <w:t xml:space="preserve"> i b e r n e t i c ă   (curs)</w:t>
             </w:r>
           </w:p>
           <w:p>
@@ -7079,23 +6822,7 @@
                 <w:sz w:val="24"/>
                 <w:szCs w:val="24"/>
               </w:rPr>
-              <w:t xml:space="preserve">Sist.de </w:t>
-            </w:r>
-            <w:proofErr w:type="spellStart"/>
-            <w:r>
-              <w:rPr>
-                <w:sz w:val="24"/>
-                <w:szCs w:val="24"/>
-              </w:rPr>
-              <w:t>oper</w:t>
-            </w:r>
-            <w:proofErr w:type="spellEnd"/>
-            <w:r>
-              <w:rPr>
-                <w:sz w:val="24"/>
-                <w:szCs w:val="24"/>
-              </w:rPr>
-              <w:t>.</w:t>
+              <w:t>Sist.de oper.</w:t>
             </w:r>
             <w:r>
               <w:rPr>
@@ -7121,21 +6848,12 @@
                 <w:szCs w:val="24"/>
               </w:rPr>
             </w:pPr>
-            <w:proofErr w:type="spellStart"/>
-            <w:r>
-              <w:rPr>
-                <w:sz w:val="24"/>
-                <w:szCs w:val="24"/>
-              </w:rPr>
-              <w:t>N.Lupu</w:t>
-            </w:r>
-            <w:proofErr w:type="spellEnd"/>
-            <w:r>
-              <w:rPr>
-                <w:sz w:val="24"/>
-                <w:szCs w:val="24"/>
-              </w:rPr>
-              <w:t xml:space="preserve">  145a/4</w:t>
+            <w:r>
+              <w:rPr>
+                <w:sz w:val="24"/>
+                <w:szCs w:val="24"/>
+              </w:rPr>
+              <w:t>N.Lupu  145a/4</w:t>
             </w:r>
           </w:p>
         </w:tc>
@@ -7666,7 +7384,6 @@
                 <w:sz w:val="40"/>
               </w:rPr>
             </w:pPr>
-            <w:proofErr w:type="spellStart"/>
             <w:r>
               <w:rPr>
                 <w:b/>
@@ -7674,7 +7391,6 @@
               </w:rPr>
               <w:t>Vineri</w:t>
             </w:r>
-            <w:proofErr w:type="spellEnd"/>
           </w:p>
         </w:tc>
         <w:tc>
@@ -8764,7 +8480,6 @@
               </w:rPr>
               <w:t xml:space="preserve"> </w:t>
             </w:r>
-            <w:proofErr w:type="spellStart"/>
             <w:r>
               <w:rPr>
                 <w:spacing w:val="40"/>
@@ -8773,7 +8488,6 @@
               </w:rPr>
               <w:t>și</w:t>
             </w:r>
-            <w:proofErr w:type="spellEnd"/>
             <w:r>
               <w:rPr>
                 <w:spacing w:val="40"/>
@@ -8838,37 +8552,12 @@
                 <w:szCs w:val="24"/>
               </w:rPr>
             </w:pPr>
-            <w:proofErr w:type="spellStart"/>
-            <w:r>
-              <w:rPr>
-                <w:sz w:val="24"/>
-                <w:szCs w:val="24"/>
-              </w:rPr>
-              <w:t>Rețele</w:t>
-            </w:r>
-            <w:proofErr w:type="spellEnd"/>
-            <w:r>
-              <w:rPr>
-                <w:sz w:val="24"/>
-                <w:szCs w:val="24"/>
-              </w:rPr>
-              <w:t xml:space="preserve"> de </w:t>
-            </w:r>
-            <w:proofErr w:type="spellStart"/>
-            <w:r>
-              <w:rPr>
-                <w:sz w:val="24"/>
-                <w:szCs w:val="24"/>
-              </w:rPr>
-              <w:t>calcul</w:t>
-            </w:r>
-            <w:proofErr w:type="spellEnd"/>
-            <w:r>
-              <w:rPr>
-                <w:sz w:val="24"/>
-                <w:szCs w:val="24"/>
-              </w:rPr>
-              <w:t>.</w:t>
+            <w:r>
+              <w:rPr>
+                <w:sz w:val="24"/>
+                <w:szCs w:val="24"/>
+              </w:rPr>
+              <w:t>Rețele de calcul.</w:t>
             </w:r>
             <w:r>
               <w:rPr>
@@ -8894,21 +8583,12 @@
                 <w:lang w:val="it-IT"/>
               </w:rPr>
             </w:pPr>
-            <w:proofErr w:type="spellStart"/>
-            <w:r>
-              <w:rPr>
-                <w:sz w:val="24"/>
-                <w:szCs w:val="24"/>
-              </w:rPr>
-              <w:t>T.Capcelea</w:t>
-            </w:r>
-            <w:proofErr w:type="spellEnd"/>
-            <w:r>
-              <w:rPr>
-                <w:sz w:val="24"/>
-                <w:szCs w:val="24"/>
-              </w:rPr>
-              <w:t xml:space="preserve">  145a/4</w:t>
+            <w:r>
+              <w:rPr>
+                <w:sz w:val="24"/>
+                <w:szCs w:val="24"/>
+              </w:rPr>
+              <w:t>T.Capcelea  145a/4</w:t>
             </w:r>
           </w:p>
         </w:tc>
@@ -9140,23 +8820,7 @@
                 <w:sz w:val="24"/>
                 <w:szCs w:val="24"/>
               </w:rPr>
-              <w:t xml:space="preserve">Sist.de </w:t>
-            </w:r>
-            <w:proofErr w:type="spellStart"/>
-            <w:r>
-              <w:rPr>
-                <w:sz w:val="24"/>
-                <w:szCs w:val="24"/>
-              </w:rPr>
-              <w:t>oper</w:t>
-            </w:r>
-            <w:proofErr w:type="spellEnd"/>
-            <w:r>
-              <w:rPr>
-                <w:sz w:val="24"/>
-                <w:szCs w:val="24"/>
-              </w:rPr>
-              <w:t>.</w:t>
+              <w:t>Sist.de oper.</w:t>
             </w:r>
             <w:r>
               <w:rPr>
@@ -9196,21 +8860,12 @@
               </w:rPr>
               <w:t xml:space="preserve"> </w:t>
             </w:r>
-            <w:proofErr w:type="spellStart"/>
-            <w:r>
-              <w:rPr>
-                <w:sz w:val="24"/>
-                <w:szCs w:val="24"/>
-              </w:rPr>
-              <w:t>N.Lupu</w:t>
-            </w:r>
-            <w:proofErr w:type="spellEnd"/>
-            <w:r>
-              <w:rPr>
-                <w:sz w:val="24"/>
-                <w:szCs w:val="24"/>
-              </w:rPr>
-              <w:t xml:space="preserve">  237/4</w:t>
+            <w:r>
+              <w:rPr>
+                <w:sz w:val="24"/>
+                <w:szCs w:val="24"/>
+              </w:rPr>
+              <w:t>N.Lupu  237/4</w:t>
             </w:r>
           </w:p>
         </w:tc>
@@ -9303,37 +8958,12 @@
                 <w:szCs w:val="24"/>
               </w:rPr>
             </w:pPr>
-            <w:proofErr w:type="spellStart"/>
-            <w:r>
-              <w:rPr>
-                <w:sz w:val="24"/>
-                <w:szCs w:val="24"/>
-              </w:rPr>
-              <w:t>Rețele</w:t>
-            </w:r>
-            <w:proofErr w:type="spellEnd"/>
-            <w:r>
-              <w:rPr>
-                <w:sz w:val="24"/>
-                <w:szCs w:val="24"/>
-              </w:rPr>
-              <w:t xml:space="preserve"> de </w:t>
-            </w:r>
-            <w:proofErr w:type="spellStart"/>
-            <w:r>
-              <w:rPr>
-                <w:sz w:val="24"/>
-                <w:szCs w:val="24"/>
-              </w:rPr>
-              <w:t>calcul</w:t>
-            </w:r>
-            <w:proofErr w:type="spellEnd"/>
-            <w:r>
-              <w:rPr>
-                <w:sz w:val="24"/>
-                <w:szCs w:val="24"/>
-              </w:rPr>
-              <w:t>.</w:t>
+            <w:r>
+              <w:rPr>
+                <w:sz w:val="24"/>
+                <w:szCs w:val="24"/>
+              </w:rPr>
+              <w:t>Rețele de calcul.</w:t>
             </w:r>
             <w:r>
               <w:rPr>
@@ -9359,7 +8989,6 @@
                 <w:lang w:val="it-IT"/>
               </w:rPr>
             </w:pPr>
-            <w:proofErr w:type="spellStart"/>
             <w:r>
               <w:rPr>
                 <w:sz w:val="24"/>
@@ -9372,15 +9001,7 @@
                 <w:sz w:val="24"/>
                 <w:szCs w:val="24"/>
               </w:rPr>
-              <w:t>.Capcelea</w:t>
-            </w:r>
-            <w:proofErr w:type="spellEnd"/>
-            <w:r>
-              <w:rPr>
-                <w:sz w:val="24"/>
-                <w:szCs w:val="24"/>
-              </w:rPr>
-              <w:t xml:space="preserve">  145a/4</w:t>
+              <w:t>.Capcelea  145a/4</w:t>
             </w:r>
           </w:p>
         </w:tc>
@@ -9577,23 +9198,7 @@
                 <w:sz w:val="22"/>
                 <w:szCs w:val="22"/>
               </w:rPr>
-              <w:t xml:space="preserve">Sist.de </w:t>
-            </w:r>
-            <w:proofErr w:type="spellStart"/>
-            <w:r>
-              <w:rPr>
-                <w:sz w:val="22"/>
-                <w:szCs w:val="22"/>
-              </w:rPr>
-              <w:t>oper</w:t>
-            </w:r>
-            <w:proofErr w:type="spellEnd"/>
-            <w:r>
-              <w:rPr>
-                <w:sz w:val="22"/>
-                <w:szCs w:val="22"/>
-              </w:rPr>
-              <w:t>.</w:t>
+              <w:t>Sist.de oper.</w:t>
             </w:r>
             <w:r>
               <w:rPr>
@@ -9633,21 +9238,12 @@
                 <w:szCs w:val="22"/>
               </w:rPr>
             </w:pPr>
-            <w:proofErr w:type="spellStart"/>
-            <w:r>
-              <w:rPr>
-                <w:sz w:val="22"/>
-                <w:szCs w:val="22"/>
-              </w:rPr>
-              <w:t>N.Lupu</w:t>
-            </w:r>
-            <w:proofErr w:type="spellEnd"/>
-            <w:r>
-              <w:rPr>
-                <w:sz w:val="22"/>
-                <w:szCs w:val="22"/>
-              </w:rPr>
-              <w:t xml:space="preserve">  237/4</w:t>
+            <w:r>
+              <w:rPr>
+                <w:sz w:val="22"/>
+                <w:szCs w:val="22"/>
+              </w:rPr>
+              <w:t>N.Lupu  237/4</w:t>
             </w:r>
           </w:p>
         </w:tc>
@@ -10006,23 +9602,7 @@
                 <w:sz w:val="22"/>
                 <w:szCs w:val="22"/>
               </w:rPr>
-              <w:t xml:space="preserve">Sist.de </w:t>
-            </w:r>
-            <w:proofErr w:type="spellStart"/>
-            <w:r>
-              <w:rPr>
-                <w:sz w:val="22"/>
-                <w:szCs w:val="22"/>
-              </w:rPr>
-              <w:t>oper</w:t>
-            </w:r>
-            <w:proofErr w:type="spellEnd"/>
-            <w:r>
-              <w:rPr>
-                <w:sz w:val="22"/>
-                <w:szCs w:val="22"/>
-              </w:rPr>
-              <w:t>.</w:t>
+              <w:t>Sist.de oper.</w:t>
             </w:r>
             <w:r>
               <w:rPr>
@@ -10036,23 +9616,7 @@
                 <w:sz w:val="22"/>
                 <w:szCs w:val="22"/>
               </w:rPr>
-              <w:t>(</w:t>
-            </w:r>
-            <w:proofErr w:type="spellStart"/>
-            <w:r>
-              <w:rPr>
-                <w:sz w:val="22"/>
-                <w:szCs w:val="22"/>
-              </w:rPr>
-              <w:t>lab,par</w:t>
-            </w:r>
-            <w:proofErr w:type="spellEnd"/>
-            <w:r>
-              <w:rPr>
-                <w:sz w:val="22"/>
-                <w:szCs w:val="22"/>
-              </w:rPr>
-              <w:t>)</w:t>
+              <w:t>(lab,par)</w:t>
             </w:r>
           </w:p>
           <w:p>
@@ -10078,21 +9642,12 @@
               </w:rPr>
               <w:t xml:space="preserve"> </w:t>
             </w:r>
-            <w:proofErr w:type="spellStart"/>
-            <w:r>
-              <w:rPr>
-                <w:sz w:val="22"/>
-                <w:szCs w:val="22"/>
-              </w:rPr>
-              <w:t>N.Lupu</w:t>
-            </w:r>
-            <w:proofErr w:type="spellEnd"/>
-            <w:r>
-              <w:rPr>
-                <w:sz w:val="22"/>
-                <w:szCs w:val="22"/>
-              </w:rPr>
-              <w:t xml:space="preserve">  237/4</w:t>
+            <w:r>
+              <w:rPr>
+                <w:sz w:val="22"/>
+                <w:szCs w:val="22"/>
+              </w:rPr>
+              <w:t>N.Lupu  237/4</w:t>
             </w:r>
           </w:p>
         </w:tc>
@@ -10138,37 +9693,12 @@
                 <w:szCs w:val="22"/>
               </w:rPr>
             </w:pPr>
-            <w:proofErr w:type="spellStart"/>
-            <w:r>
-              <w:rPr>
-                <w:sz w:val="22"/>
-                <w:szCs w:val="22"/>
-              </w:rPr>
-              <w:t>Rețele</w:t>
-            </w:r>
-            <w:proofErr w:type="spellEnd"/>
-            <w:r>
-              <w:rPr>
-                <w:sz w:val="22"/>
-                <w:szCs w:val="22"/>
-              </w:rPr>
-              <w:t xml:space="preserve"> de </w:t>
-            </w:r>
-            <w:proofErr w:type="spellStart"/>
-            <w:r>
-              <w:rPr>
-                <w:sz w:val="22"/>
-                <w:szCs w:val="22"/>
-              </w:rPr>
-              <w:t>calcul</w:t>
-            </w:r>
-            <w:proofErr w:type="spellEnd"/>
-            <w:r>
-              <w:rPr>
-                <w:sz w:val="22"/>
-                <w:szCs w:val="22"/>
-              </w:rPr>
-              <w:t>.</w:t>
+            <w:r>
+              <w:rPr>
+                <w:sz w:val="22"/>
+                <w:szCs w:val="22"/>
+              </w:rPr>
+              <w:t>Rețele de calcul.</w:t>
             </w:r>
             <w:r>
               <w:rPr>
@@ -10182,23 +9712,7 @@
                 <w:sz w:val="22"/>
                 <w:szCs w:val="22"/>
               </w:rPr>
-              <w:t>(</w:t>
-            </w:r>
-            <w:proofErr w:type="spellStart"/>
-            <w:r>
-              <w:rPr>
-                <w:sz w:val="22"/>
-                <w:szCs w:val="22"/>
-              </w:rPr>
-              <w:t>lab,par</w:t>
-            </w:r>
-            <w:proofErr w:type="spellEnd"/>
-            <w:r>
-              <w:rPr>
-                <w:sz w:val="22"/>
-                <w:szCs w:val="22"/>
-              </w:rPr>
-              <w:t>)</w:t>
+              <w:t>(lab,par)</w:t>
             </w:r>
           </w:p>
           <w:p>
@@ -10212,7 +9726,6 @@
                 <w:lang w:val="it-IT"/>
               </w:rPr>
             </w:pPr>
-            <w:proofErr w:type="spellStart"/>
             <w:r>
               <w:rPr>
                 <w:sz w:val="22"/>
@@ -10225,15 +9738,7 @@
                 <w:sz w:val="22"/>
                 <w:szCs w:val="22"/>
               </w:rPr>
-              <w:t>.Capcelea</w:t>
-            </w:r>
-            <w:proofErr w:type="spellEnd"/>
-            <w:r>
-              <w:rPr>
-                <w:sz w:val="22"/>
-                <w:szCs w:val="22"/>
-              </w:rPr>
-              <w:t xml:space="preserve">  145a/4</w:t>
+              <w:t>.Capcelea  145a/4</w:t>
             </w:r>
           </w:p>
         </w:tc>
@@ -10270,7 +9775,6 @@
                 <w:sz w:val="40"/>
               </w:rPr>
             </w:pPr>
-            <w:proofErr w:type="spellStart"/>
             <w:r>
               <w:rPr>
                 <w:b/>
@@ -10278,7 +9782,6 @@
               </w:rPr>
               <w:t>Sâmbătă</w:t>
             </w:r>
-            <w:proofErr w:type="spellEnd"/>
           </w:p>
         </w:tc>
         <w:tc>
@@ -11092,141 +10595,93 @@
                 <w:b/>
                 <w:sz w:val="40"/>
               </w:rPr>
-              <w:t>02(</w:t>
-            </w:r>
-            <w:proofErr w:type="spellStart"/>
-            <w:r>
+              <w:t>02(ru)</w:t>
+            </w:r>
+          </w:p>
+        </w:tc>
+        <w:tc>
+          <w:tcPr>
+            <w:tcW w:w="2333" w:type="dxa"/>
+            <w:tcBorders>
+              <w:top w:val="single" w:sz="24" w:space="0" w:color="auto"/>
+              <w:left w:val="single" w:sz="4" w:space="0" w:color="auto"/>
+              <w:bottom w:val="single" w:sz="24" w:space="0" w:color="auto"/>
+              <w:right w:val="single" w:sz="4" w:space="0" w:color="auto"/>
+            </w:tcBorders>
+            <w:vAlign w:val="center"/>
+          </w:tcPr>
+          <w:p>
+            <w:pPr>
+              <w:ind w:left="-113" w:right="-113"/>
+              <w:jc w:val="center"/>
               <w:rPr>
                 <w:b/>
                 <w:sz w:val="40"/>
               </w:rPr>
-              <w:t>ru</w:t>
-            </w:r>
-            <w:proofErr w:type="spellEnd"/>
+            </w:pPr>
             <w:r>
               <w:rPr>
                 <w:b/>
                 <w:sz w:val="40"/>
               </w:rPr>
-              <w:t>)</w:t>
-            </w:r>
-          </w:p>
-        </w:tc>
-        <w:tc>
-          <w:tcPr>
-            <w:tcW w:w="2333" w:type="dxa"/>
-            <w:tcBorders>
-              <w:top w:val="single" w:sz="24" w:space="0" w:color="auto"/>
-              <w:left w:val="single" w:sz="4" w:space="0" w:color="auto"/>
-              <w:bottom w:val="single" w:sz="24" w:space="0" w:color="auto"/>
-              <w:right w:val="single" w:sz="4" w:space="0" w:color="auto"/>
-            </w:tcBorders>
-            <w:vAlign w:val="center"/>
-          </w:tcPr>
-          <w:p>
-            <w:pPr>
-              <w:ind w:left="-113" w:right="-113"/>
-              <w:jc w:val="center"/>
+              <w:t>IA2</w:t>
+            </w:r>
+            <w:r>
               <w:rPr>
                 <w:b/>
                 <w:sz w:val="40"/>
               </w:rPr>
-            </w:pPr>
+              <w:t>6</w:t>
+            </w:r>
             <w:r>
               <w:rPr>
                 <w:b/>
                 <w:sz w:val="40"/>
               </w:rPr>
-              <w:t>IA2</w:t>
-            </w:r>
-            <w:r>
+              <w:t>03(ru)</w:t>
+            </w:r>
+          </w:p>
+        </w:tc>
+        <w:tc>
+          <w:tcPr>
+            <w:tcW w:w="2333" w:type="dxa"/>
+            <w:tcBorders>
+              <w:top w:val="single" w:sz="24" w:space="0" w:color="auto"/>
+              <w:left w:val="single" w:sz="4" w:space="0" w:color="auto"/>
+              <w:bottom w:val="single" w:sz="24" w:space="0" w:color="auto"/>
+              <w:right w:val="single" w:sz="4" w:space="0" w:color="auto"/>
+            </w:tcBorders>
+            <w:vAlign w:val="center"/>
+          </w:tcPr>
+          <w:p>
+            <w:pPr>
+              <w:ind w:left="-113" w:right="-113"/>
+              <w:jc w:val="center"/>
               <w:rPr>
                 <w:b/>
                 <w:sz w:val="40"/>
               </w:rPr>
-              <w:t>6</w:t>
-            </w:r>
+            </w:pPr>
             <w:r>
               <w:rPr>
                 <w:b/>
                 <w:sz w:val="40"/>
               </w:rPr>
-              <w:t>03(</w:t>
-            </w:r>
-            <w:proofErr w:type="spellStart"/>
+              <w:t>IA2</w:t>
+            </w:r>
             <w:r>
               <w:rPr>
                 <w:b/>
                 <w:sz w:val="40"/>
               </w:rPr>
-              <w:t>ru</w:t>
-            </w:r>
-            <w:proofErr w:type="spellEnd"/>
+              <w:t>6</w:t>
+            </w:r>
             <w:r>
               <w:rPr>
                 <w:b/>
                 <w:sz w:val="40"/>
               </w:rPr>
-              <w:t>)</w:t>
-            </w:r>
-          </w:p>
-        </w:tc>
-        <w:tc>
-          <w:tcPr>
-            <w:tcW w:w="2333" w:type="dxa"/>
-            <w:tcBorders>
-              <w:top w:val="single" w:sz="24" w:space="0" w:color="auto"/>
-              <w:left w:val="single" w:sz="4" w:space="0" w:color="auto"/>
-              <w:bottom w:val="single" w:sz="24" w:space="0" w:color="auto"/>
-              <w:right w:val="single" w:sz="4" w:space="0" w:color="auto"/>
-            </w:tcBorders>
-            <w:vAlign w:val="center"/>
-          </w:tcPr>
-          <w:p>
-            <w:pPr>
-              <w:ind w:left="-113" w:right="-113"/>
-              <w:jc w:val="center"/>
-              <w:rPr>
-                <w:b/>
-                <w:sz w:val="40"/>
-              </w:rPr>
-            </w:pPr>
-            <w:r>
-              <w:rPr>
-                <w:b/>
-                <w:sz w:val="40"/>
-              </w:rPr>
-              <w:t>IA2</w:t>
-            </w:r>
-            <w:r>
-              <w:rPr>
-                <w:b/>
-                <w:sz w:val="40"/>
-              </w:rPr>
-              <w:t>6</w:t>
-            </w:r>
-            <w:r>
-              <w:rPr>
-                <w:b/>
-                <w:sz w:val="40"/>
-              </w:rPr>
-              <w:t>04(</w:t>
-            </w:r>
-            <w:proofErr w:type="spellStart"/>
-            <w:r>
-              <w:rPr>
-                <w:b/>
-                <w:sz w:val="40"/>
-              </w:rPr>
-              <w:t>ru</w:t>
-            </w:r>
-            <w:proofErr w:type="spellEnd"/>
-            <w:r>
-              <w:rPr>
-                <w:b/>
-                <w:sz w:val="40"/>
-              </w:rPr>
-              <w:t>)</w:t>
+              <w:t>04(ru)</w:t>
             </w:r>
           </w:p>
         </w:tc>
@@ -11270,23 +10725,7 @@
                 <w:b/>
                 <w:sz w:val="40"/>
               </w:rPr>
-              <w:t>01(</w:t>
-            </w:r>
-            <w:proofErr w:type="spellStart"/>
-            <w:r>
-              <w:rPr>
-                <w:b/>
-                <w:sz w:val="40"/>
-              </w:rPr>
-              <w:t>ro</w:t>
-            </w:r>
-            <w:proofErr w:type="spellEnd"/>
-            <w:r>
-              <w:rPr>
-                <w:b/>
-                <w:sz w:val="40"/>
-              </w:rPr>
-              <w:t>)</w:t>
+              <w:t>01(ro)</w:t>
             </w:r>
           </w:p>
         </w:tc>
@@ -11330,23 +10769,7 @@
                 <w:b/>
                 <w:sz w:val="40"/>
               </w:rPr>
-              <w:t>02(</w:t>
-            </w:r>
-            <w:proofErr w:type="spellStart"/>
-            <w:r>
-              <w:rPr>
-                <w:b/>
-                <w:sz w:val="40"/>
-              </w:rPr>
-              <w:t>ru</w:t>
-            </w:r>
-            <w:proofErr w:type="spellEnd"/>
-            <w:r>
-              <w:rPr>
-                <w:b/>
-                <w:sz w:val="40"/>
-              </w:rPr>
-              <w:t>)</w:t>
+              <w:t>02(ru)</w:t>
             </w:r>
           </w:p>
         </w:tc>
@@ -11455,7 +10878,6 @@
                 <w:lang w:val="ro-RO"/>
               </w:rPr>
             </w:pPr>
-            <w:proofErr w:type="spellStart"/>
             <w:r>
               <w:rPr>
                 <w:b/>
@@ -11463,7 +10885,6 @@
               </w:rPr>
               <w:t>Luni</w:t>
             </w:r>
-            <w:proofErr w:type="spellEnd"/>
           </w:p>
         </w:tc>
         <w:tc>
@@ -13128,7 +12549,15 @@
                 <w:szCs w:val="24"/>
                 <w:lang w:val="it-IT"/>
               </w:rPr>
-              <w:t>F.Damian   113/4</w:t>
+              <w:t>L.Solovei</w:t>
+            </w:r>
+            <w:r>
+              <w:rPr>
+                <w:sz w:val="24"/>
+                <w:szCs w:val="24"/>
+                <w:lang w:val="it-IT"/>
+              </w:rPr>
+              <w:t xml:space="preserve">   113/4</w:t>
             </w:r>
           </w:p>
         </w:tc>
@@ -13312,7 +12741,6 @@
                 <w:sz w:val="40"/>
               </w:rPr>
             </w:pPr>
-            <w:proofErr w:type="spellStart"/>
             <w:r>
               <w:rPr>
                 <w:b/>
@@ -13320,7 +12748,6 @@
               </w:rPr>
               <w:t>Marţi</w:t>
             </w:r>
-            <w:proofErr w:type="spellEnd"/>
           </w:p>
         </w:tc>
         <w:tc>
@@ -13498,7 +12925,31 @@
                 <w:szCs w:val="24"/>
                 <w:lang w:val="it-IT"/>
               </w:rPr>
-              <w:t>E.Murea 404/4</w:t>
+              <w:t>A.Coliban</w:t>
+            </w:r>
+            <w:r>
+              <w:rPr>
+                <w:sz w:val="24"/>
+                <w:szCs w:val="24"/>
+                <w:lang w:val="it-IT"/>
+              </w:rPr>
+              <w:t xml:space="preserve"> </w:t>
+            </w:r>
+            <w:r>
+              <w:rPr>
+                <w:sz w:val="24"/>
+                <w:szCs w:val="24"/>
+                <w:lang w:val="it-IT"/>
+              </w:rPr>
+              <w:t xml:space="preserve"> </w:t>
+            </w:r>
+            <w:r>
+              <w:rPr>
+                <w:sz w:val="24"/>
+                <w:szCs w:val="24"/>
+                <w:lang w:val="it-IT"/>
+              </w:rPr>
+              <w:t>404/4</w:t>
             </w:r>
           </w:p>
         </w:tc>
@@ -13704,23 +13155,7 @@
                 <w:sz w:val="24"/>
                 <w:szCs w:val="24"/>
               </w:rPr>
-              <w:t xml:space="preserve">Sist.de </w:t>
-            </w:r>
-            <w:proofErr w:type="spellStart"/>
-            <w:r>
-              <w:rPr>
-                <w:sz w:val="24"/>
-                <w:szCs w:val="24"/>
-              </w:rPr>
-              <w:t>oper</w:t>
-            </w:r>
-            <w:proofErr w:type="spellEnd"/>
-            <w:r>
-              <w:rPr>
-                <w:sz w:val="24"/>
-                <w:szCs w:val="24"/>
-              </w:rPr>
-              <w:t>.</w:t>
+              <w:t>Sist.de oper.</w:t>
             </w:r>
             <w:r>
               <w:rPr>
@@ -13759,21 +13194,12 @@
               </w:rPr>
               <w:t xml:space="preserve"> </w:t>
             </w:r>
-            <w:proofErr w:type="spellStart"/>
-            <w:r>
-              <w:rPr>
-                <w:sz w:val="24"/>
-                <w:szCs w:val="24"/>
-              </w:rPr>
-              <w:t>M.Butnaru</w:t>
-            </w:r>
-            <w:proofErr w:type="spellEnd"/>
-            <w:r>
-              <w:rPr>
-                <w:sz w:val="24"/>
-                <w:szCs w:val="24"/>
-              </w:rPr>
-              <w:t xml:space="preserve">  251/4</w:t>
+            <w:r>
+              <w:rPr>
+                <w:sz w:val="24"/>
+                <w:szCs w:val="24"/>
+              </w:rPr>
+              <w:t>M.Butnaru  251/4</w:t>
             </w:r>
           </w:p>
           <w:p>
@@ -13941,7 +13367,31 @@
                 <w:szCs w:val="24"/>
                 <w:lang w:val="it-IT"/>
               </w:rPr>
-              <w:t>E.Murea 404/4</w:t>
+              <w:t>A.Coliban</w:t>
+            </w:r>
+            <w:r>
+              <w:rPr>
+                <w:sz w:val="24"/>
+                <w:szCs w:val="24"/>
+                <w:lang w:val="it-IT"/>
+              </w:rPr>
+              <w:t xml:space="preserve"> </w:t>
+            </w:r>
+            <w:r>
+              <w:rPr>
+                <w:sz w:val="24"/>
+                <w:szCs w:val="24"/>
+                <w:lang w:val="it-IT"/>
+              </w:rPr>
+              <w:t xml:space="preserve"> </w:t>
+            </w:r>
+            <w:r>
+              <w:rPr>
+                <w:sz w:val="24"/>
+                <w:szCs w:val="24"/>
+                <w:lang w:val="it-IT"/>
+              </w:rPr>
+              <w:t>404/4</w:t>
             </w:r>
           </w:p>
         </w:tc>
@@ -14005,7 +13455,15 @@
                 <w:szCs w:val="24"/>
                 <w:lang w:val="it-IT"/>
               </w:rPr>
-              <w:t>E.Murea 404/4</w:t>
+              <w:t xml:space="preserve">A.Coliban </w:t>
+            </w:r>
+            <w:r>
+              <w:rPr>
+                <w:sz w:val="24"/>
+                <w:szCs w:val="24"/>
+                <w:lang w:val="it-IT"/>
+              </w:rPr>
+              <w:t xml:space="preserve"> 404/4</w:t>
             </w:r>
           </w:p>
         </w:tc>
@@ -14344,31 +13802,7 @@
                 <w:sz w:val="22"/>
                 <w:szCs w:val="22"/>
               </w:rPr>
-              <w:t xml:space="preserve">Sist.de </w:t>
-            </w:r>
-            <w:proofErr w:type="spellStart"/>
-            <w:r>
-              <w:rPr>
-                <w:sz w:val="22"/>
-                <w:szCs w:val="22"/>
-              </w:rPr>
-              <w:t>oper</w:t>
-            </w:r>
-            <w:proofErr w:type="spellEnd"/>
-            <w:r>
-              <w:rPr>
-                <w:sz w:val="22"/>
-                <w:szCs w:val="22"/>
-              </w:rPr>
-              <w:t>.(</w:t>
-            </w:r>
-            <w:proofErr w:type="spellStart"/>
-            <w:r>
-              <w:rPr>
-                <w:sz w:val="22"/>
-                <w:szCs w:val="22"/>
-              </w:rPr>
-              <w:t>lab</w:t>
+              <w:t>Sist.de oper.(lab</w:t>
             </w:r>
             <w:r>
               <w:rPr>
@@ -14377,7 +13811,6 @@
               </w:rPr>
               <w:t>,imp</w:t>
             </w:r>
-            <w:proofErr w:type="spellEnd"/>
             <w:r>
               <w:rPr>
                 <w:sz w:val="22"/>
@@ -14394,21 +13827,12 @@
                 <w:szCs w:val="24"/>
               </w:rPr>
             </w:pPr>
-            <w:proofErr w:type="spellStart"/>
-            <w:r>
-              <w:rPr>
-                <w:sz w:val="22"/>
-                <w:szCs w:val="22"/>
-              </w:rPr>
-              <w:t>G.Marin</w:t>
-            </w:r>
-            <w:proofErr w:type="spellEnd"/>
-            <w:r>
-              <w:rPr>
-                <w:sz w:val="22"/>
-                <w:szCs w:val="22"/>
-              </w:rPr>
-              <w:t xml:space="preserve">    326</w:t>
+            <w:r>
+              <w:rPr>
+                <w:sz w:val="22"/>
+                <w:szCs w:val="22"/>
+              </w:rPr>
+              <w:t>G.Marin    326</w:t>
             </w:r>
             <w:r>
               <w:rPr>
@@ -14485,21 +13909,12 @@
               </w:rPr>
               <w:t xml:space="preserve"> </w:t>
             </w:r>
-            <w:proofErr w:type="spellStart"/>
-            <w:r>
-              <w:rPr>
-                <w:sz w:val="22"/>
-                <w:szCs w:val="22"/>
-              </w:rPr>
-              <w:t>B.Vișnevschi</w:t>
-            </w:r>
-            <w:proofErr w:type="spellEnd"/>
-            <w:r>
-              <w:rPr>
-                <w:sz w:val="22"/>
-                <w:szCs w:val="22"/>
-              </w:rPr>
-              <w:t xml:space="preserve">  251/4</w:t>
+            <w:r>
+              <w:rPr>
+                <w:sz w:val="22"/>
+                <w:szCs w:val="22"/>
+              </w:rPr>
+              <w:t>B.Vișnevschi  251/4</w:t>
             </w:r>
           </w:p>
           <w:p>
@@ -14524,21 +13939,12 @@
               </w:rPr>
               <w:t xml:space="preserve"> </w:t>
             </w:r>
-            <w:proofErr w:type="spellStart"/>
-            <w:r>
-              <w:rPr>
-                <w:sz w:val="22"/>
-                <w:szCs w:val="22"/>
-              </w:rPr>
-              <w:t>V.Vișnevschi</w:t>
-            </w:r>
-            <w:proofErr w:type="spellEnd"/>
-            <w:r>
-              <w:rPr>
-                <w:sz w:val="22"/>
-                <w:szCs w:val="22"/>
-              </w:rPr>
-              <w:t xml:space="preserve"> 145a/4</w:t>
+            <w:r>
+              <w:rPr>
+                <w:sz w:val="22"/>
+                <w:szCs w:val="22"/>
+              </w:rPr>
+              <w:t>V.Vișnevschi 145a/4</w:t>
             </w:r>
           </w:p>
         </w:tc>
@@ -14564,31 +13970,7 @@
                 <w:sz w:val="22"/>
                 <w:szCs w:val="22"/>
               </w:rPr>
-              <w:t xml:space="preserve">Sist.de </w:t>
-            </w:r>
-            <w:proofErr w:type="spellStart"/>
-            <w:r>
-              <w:rPr>
-                <w:sz w:val="22"/>
-                <w:szCs w:val="22"/>
-              </w:rPr>
-              <w:t>oper</w:t>
-            </w:r>
-            <w:proofErr w:type="spellEnd"/>
-            <w:r>
-              <w:rPr>
-                <w:sz w:val="22"/>
-                <w:szCs w:val="22"/>
-              </w:rPr>
-              <w:t>.(</w:t>
-            </w:r>
-            <w:proofErr w:type="spellStart"/>
-            <w:r>
-              <w:rPr>
-                <w:sz w:val="22"/>
-                <w:szCs w:val="22"/>
-              </w:rPr>
-              <w:t>lab</w:t>
+              <w:t>Sist.de oper.(lab</w:t>
             </w:r>
             <w:r>
               <w:rPr>
@@ -14597,7 +13979,6 @@
               </w:rPr>
               <w:t>,imp</w:t>
             </w:r>
-            <w:proofErr w:type="spellEnd"/>
             <w:r>
               <w:rPr>
                 <w:sz w:val="22"/>
@@ -14628,21 +14009,12 @@
               </w:rPr>
               <w:t xml:space="preserve"> </w:t>
             </w:r>
-            <w:proofErr w:type="spellStart"/>
-            <w:r>
-              <w:rPr>
-                <w:sz w:val="22"/>
-                <w:szCs w:val="22"/>
-              </w:rPr>
-              <w:t>M.Butnaru</w:t>
-            </w:r>
-            <w:proofErr w:type="spellEnd"/>
-            <w:r>
-              <w:rPr>
-                <w:sz w:val="22"/>
-                <w:szCs w:val="22"/>
-              </w:rPr>
-              <w:t xml:space="preserve">  145</w:t>
+            <w:r>
+              <w:rPr>
+                <w:sz w:val="22"/>
+                <w:szCs w:val="22"/>
+              </w:rPr>
+              <w:t>M.Butnaru  145</w:t>
             </w:r>
             <w:r>
               <w:rPr>
@@ -14967,31 +14339,7 @@
                 <w:sz w:val="22"/>
                 <w:szCs w:val="22"/>
               </w:rPr>
-              <w:t xml:space="preserve">Sist.de </w:t>
-            </w:r>
-            <w:proofErr w:type="spellStart"/>
-            <w:r>
-              <w:rPr>
-                <w:sz w:val="22"/>
-                <w:szCs w:val="22"/>
-              </w:rPr>
-              <w:t>oper</w:t>
-            </w:r>
-            <w:proofErr w:type="spellEnd"/>
-            <w:r>
-              <w:rPr>
-                <w:sz w:val="22"/>
-                <w:szCs w:val="22"/>
-              </w:rPr>
-              <w:t>.(</w:t>
-            </w:r>
-            <w:proofErr w:type="spellStart"/>
-            <w:r>
-              <w:rPr>
-                <w:sz w:val="22"/>
-                <w:szCs w:val="22"/>
-              </w:rPr>
-              <w:t>lab</w:t>
+              <w:t>Sist.de oper.(lab</w:t>
             </w:r>
             <w:r>
               <w:rPr>
@@ -15000,7 +14348,6 @@
               </w:rPr>
               <w:t>,par</w:t>
             </w:r>
-            <w:proofErr w:type="spellEnd"/>
             <w:r>
               <w:rPr>
                 <w:sz w:val="22"/>
@@ -15239,7 +14586,6 @@
                 <w:sz w:val="40"/>
               </w:rPr>
             </w:pPr>
-            <w:proofErr w:type="spellStart"/>
             <w:r>
               <w:rPr>
                 <w:b/>
@@ -15247,7 +14593,6 @@
               </w:rPr>
               <w:t>Miercuri</w:t>
             </w:r>
-            <w:proofErr w:type="spellEnd"/>
           </w:p>
         </w:tc>
         <w:tc>
@@ -15950,7 +15295,7 @@
                 <w:szCs w:val="32"/>
                 <w:lang w:val="it-IT"/>
               </w:rPr>
-              <w:t xml:space="preserve">Securitatea </w:t>
+              <w:t xml:space="preserve">Securitatea  </w:t>
             </w:r>
             <w:r>
               <w:rPr>
@@ -16272,21 +15617,12 @@
                 <w:szCs w:val="24"/>
               </w:rPr>
             </w:pPr>
-            <w:proofErr w:type="spellStart"/>
-            <w:r>
-              <w:rPr>
-                <w:sz w:val="24"/>
-                <w:szCs w:val="24"/>
-              </w:rPr>
-              <w:t>G.Marin</w:t>
-            </w:r>
-            <w:proofErr w:type="spellEnd"/>
-            <w:r>
-              <w:rPr>
-                <w:sz w:val="24"/>
-                <w:szCs w:val="24"/>
-              </w:rPr>
-              <w:t xml:space="preserve">  326/4</w:t>
+            <w:r>
+              <w:rPr>
+                <w:sz w:val="24"/>
+                <w:szCs w:val="24"/>
+              </w:rPr>
+              <w:t>G.Marin  326/4</w:t>
             </w:r>
           </w:p>
         </w:tc>
@@ -16909,7 +16245,21 @@
                 <w:sz w:val="22"/>
                 <w:szCs w:val="22"/>
               </w:rPr>
-              <w:t>I:B.Vișnevschi  218/4</w:t>
+              <w:t>I:</w:t>
+            </w:r>
+            <w:r>
+              <w:rPr>
+                <w:sz w:val="22"/>
+                <w:szCs w:val="22"/>
+              </w:rPr>
+              <w:t xml:space="preserve"> </w:t>
+            </w:r>
+            <w:r>
+              <w:rPr>
+                <w:sz w:val="22"/>
+                <w:szCs w:val="22"/>
+              </w:rPr>
+              <w:t>B.Vișnevschi  218/4</w:t>
             </w:r>
             <w:r>
               <w:rPr>
@@ -16929,21 +16279,26 @@
                 <w:szCs w:val="24"/>
               </w:rPr>
             </w:pPr>
-            <w:proofErr w:type="spellStart"/>
-            <w:r>
-              <w:rPr>
-                <w:sz w:val="22"/>
-                <w:szCs w:val="22"/>
-              </w:rPr>
-              <w:t>II:V.Vișnevschi</w:t>
-            </w:r>
-            <w:proofErr w:type="spellEnd"/>
-            <w:r>
-              <w:rPr>
-                <w:sz w:val="22"/>
-                <w:szCs w:val="22"/>
-              </w:rPr>
-              <w:t xml:space="preserve">  21</w:t>
+            <w:r>
+              <w:rPr>
+                <w:sz w:val="22"/>
+                <w:szCs w:val="22"/>
+              </w:rPr>
+              <w:t>II:</w:t>
+            </w:r>
+            <w:r>
+              <w:rPr>
+                <w:sz w:val="22"/>
+                <w:szCs w:val="22"/>
+              </w:rPr>
+              <w:t xml:space="preserve"> </w:t>
+            </w:r>
+            <w:r>
+              <w:rPr>
+                <w:sz w:val="22"/>
+                <w:szCs w:val="22"/>
+              </w:rPr>
+              <w:t>V.Vișnevschi  21</w:t>
             </w:r>
             <w:r>
               <w:rPr>
@@ -17751,23 +17106,7 @@
                 <w:sz w:val="24"/>
                 <w:szCs w:val="24"/>
               </w:rPr>
-              <w:t xml:space="preserve">Sist.de </w:t>
-            </w:r>
-            <w:proofErr w:type="spellStart"/>
-            <w:r>
-              <w:rPr>
-                <w:sz w:val="24"/>
-                <w:szCs w:val="24"/>
-              </w:rPr>
-              <w:t>oper</w:t>
-            </w:r>
-            <w:proofErr w:type="spellEnd"/>
-            <w:r>
-              <w:rPr>
-                <w:sz w:val="24"/>
-                <w:szCs w:val="24"/>
-              </w:rPr>
-              <w:t>.(lab)</w:t>
+              <w:t>Sist.de oper.(lab)</w:t>
             </w:r>
           </w:p>
           <w:p>
@@ -18785,29 +18124,13 @@
               <w:jc w:val="center"/>
             </w:pPr>
             <w:r>
-              <w:t xml:space="preserve">Sist.de </w:t>
-            </w:r>
-            <w:proofErr w:type="spellStart"/>
-            <w:r>
-              <w:t>oper</w:t>
-            </w:r>
-            <w:proofErr w:type="spellEnd"/>
-            <w:r>
-              <w:t>.</w:t>
+              <w:t>Sist.de oper.</w:t>
             </w:r>
             <w:r>
               <w:t xml:space="preserve"> </w:t>
             </w:r>
             <w:r>
-              <w:t>(</w:t>
-            </w:r>
-            <w:proofErr w:type="spellStart"/>
-            <w:r>
-              <w:t>lab,par</w:t>
-            </w:r>
-            <w:proofErr w:type="spellEnd"/>
-            <w:r>
-              <w:t>)</w:t>
+              <w:t>(lab,par)</w:t>
             </w:r>
           </w:p>
           <w:p>
@@ -18822,13 +18145,8 @@
             <w:r>
               <w:t xml:space="preserve"> </w:t>
             </w:r>
-            <w:proofErr w:type="spellStart"/>
-            <w:r>
-              <w:t>M.Butnaru</w:t>
-            </w:r>
-            <w:proofErr w:type="spellEnd"/>
-            <w:r>
-              <w:t xml:space="preserve">  350</w:t>
+            <w:r>
+              <w:t>M.Butnaru  350</w:t>
             </w:r>
             <w:r>
               <w:t>/4</w:t>
@@ -19233,23 +18551,7 @@
                 <w:sz w:val="24"/>
                 <w:szCs w:val="24"/>
               </w:rPr>
-              <w:t xml:space="preserve">Sist.de </w:t>
-            </w:r>
-            <w:proofErr w:type="spellStart"/>
-            <w:r>
-              <w:rPr>
-                <w:sz w:val="24"/>
-                <w:szCs w:val="24"/>
-              </w:rPr>
-              <w:t>oper</w:t>
-            </w:r>
-            <w:proofErr w:type="spellEnd"/>
-            <w:r>
-              <w:rPr>
-                <w:sz w:val="24"/>
-                <w:szCs w:val="24"/>
-              </w:rPr>
-              <w:t>.</w:t>
+              <w:t>Sist.de oper.</w:t>
             </w:r>
             <w:r>
               <w:rPr>
@@ -19354,23 +18656,7 @@
                 <w:sz w:val="24"/>
                 <w:szCs w:val="24"/>
               </w:rPr>
-              <w:t xml:space="preserve">Sist.de </w:t>
-            </w:r>
-            <w:proofErr w:type="spellStart"/>
-            <w:r>
-              <w:rPr>
-                <w:sz w:val="24"/>
-                <w:szCs w:val="24"/>
-              </w:rPr>
-              <w:t>oper</w:t>
-            </w:r>
-            <w:proofErr w:type="spellEnd"/>
-            <w:r>
-              <w:rPr>
-                <w:sz w:val="24"/>
-                <w:szCs w:val="24"/>
-              </w:rPr>
-              <w:t>.(lab)</w:t>
+              <w:t>Sist.de oper.(lab)</w:t>
             </w:r>
           </w:p>
           <w:p>
@@ -19396,21 +18682,12 @@
               </w:rPr>
               <w:t xml:space="preserve"> </w:t>
             </w:r>
-            <w:proofErr w:type="spellStart"/>
-            <w:r>
-              <w:rPr>
-                <w:sz w:val="24"/>
-                <w:szCs w:val="24"/>
-              </w:rPr>
-              <w:t>M.Butnaru</w:t>
-            </w:r>
-            <w:proofErr w:type="spellEnd"/>
-            <w:r>
-              <w:rPr>
-                <w:sz w:val="24"/>
-                <w:szCs w:val="24"/>
-              </w:rPr>
-              <w:t xml:space="preserve">  237/4</w:t>
+            <w:r>
+              <w:rPr>
+                <w:sz w:val="24"/>
+                <w:szCs w:val="24"/>
+              </w:rPr>
+              <w:t>M.Butnaru  237/4</w:t>
             </w:r>
           </w:p>
           <w:p>
@@ -20745,7 +20022,6 @@
                 <w:sz w:val="40"/>
               </w:rPr>
             </w:pPr>
-            <w:proofErr w:type="spellStart"/>
             <w:r>
               <w:rPr>
                 <w:b/>
@@ -20753,7 +20029,6 @@
               </w:rPr>
               <w:t>Vineri</w:t>
             </w:r>
-            <w:proofErr w:type="spellEnd"/>
           </w:p>
         </w:tc>
         <w:tc>
@@ -22070,25 +21345,7 @@
                 <w:sz w:val="32"/>
                 <w:szCs w:val="32"/>
               </w:rPr>
-              <w:t xml:space="preserve">HTML  </w:t>
-            </w:r>
-            <w:proofErr w:type="spellStart"/>
-            <w:r>
-              <w:rPr>
-                <w:spacing w:val="40"/>
-                <w:sz w:val="32"/>
-                <w:szCs w:val="32"/>
-              </w:rPr>
-              <w:t>și</w:t>
-            </w:r>
-            <w:proofErr w:type="spellEnd"/>
-            <w:r>
-              <w:rPr>
-                <w:spacing w:val="40"/>
-                <w:sz w:val="32"/>
-                <w:szCs w:val="32"/>
-              </w:rPr>
-              <w:t xml:space="preserve">  CSS   (curs)</w:t>
+              <w:t>HTML  și  CSS   (curs)</w:t>
             </w:r>
           </w:p>
           <w:p>
@@ -22898,7 +22155,15 @@
                 <w:szCs w:val="22"/>
                 <w:lang w:val="it-IT"/>
               </w:rPr>
-              <w:t>F.Damian    222</w:t>
+              <w:t>L.Solovei</w:t>
+            </w:r>
+            <w:r>
+              <w:rPr>
+                <w:sz w:val="22"/>
+                <w:szCs w:val="22"/>
+                <w:lang w:val="it-IT"/>
+              </w:rPr>
+              <w:t xml:space="preserve">   222</w:t>
             </w:r>
             <w:r>
               <w:rPr>
@@ -23015,7 +22280,6 @@
                 <w:sz w:val="40"/>
               </w:rPr>
             </w:pPr>
-            <w:proofErr w:type="spellStart"/>
             <w:r>
               <w:rPr>
                 <w:b/>
@@ -23023,7 +22287,6 @@
               </w:rPr>
               <w:t>Sâmbătă</w:t>
             </w:r>
-            <w:proofErr w:type="spellEnd"/>
           </w:p>
         </w:tc>
         <w:tc>
@@ -25230,64 +24493,64 @@
       </w:pPr>
     </w:lvl>
   </w:abstractNum>
-  <w:num w:numId="1" w16cid:durableId="1305431452">
+  <w:num w:numId="1" w16cid:durableId="1963002051">
     <w:abstractNumId w:val="14"/>
   </w:num>
-  <w:num w:numId="2" w16cid:durableId="335153850">
+  <w:num w:numId="2" w16cid:durableId="1068308526">
     <w:abstractNumId w:val="10"/>
   </w:num>
-  <w:num w:numId="3" w16cid:durableId="638461232">
+  <w:num w:numId="3" w16cid:durableId="1312711039">
     <w:abstractNumId w:val="3"/>
   </w:num>
-  <w:num w:numId="4" w16cid:durableId="1438405906">
+  <w:num w:numId="4" w16cid:durableId="144323101">
     <w:abstractNumId w:val="12"/>
   </w:num>
-  <w:num w:numId="5" w16cid:durableId="1407679810">
+  <w:num w:numId="5" w16cid:durableId="1297684875">
     <w:abstractNumId w:val="4"/>
   </w:num>
-  <w:num w:numId="6" w16cid:durableId="860900769">
+  <w:num w:numId="6" w16cid:durableId="395737042">
     <w:abstractNumId w:val="8"/>
   </w:num>
-  <w:num w:numId="7" w16cid:durableId="1871071241">
+  <w:num w:numId="7" w16cid:durableId="2140688818">
     <w:abstractNumId w:val="5"/>
   </w:num>
-  <w:num w:numId="8" w16cid:durableId="855116633">
+  <w:num w:numId="8" w16cid:durableId="1752964092">
     <w:abstractNumId w:val="9"/>
   </w:num>
-  <w:num w:numId="9" w16cid:durableId="2061201828">
+  <w:num w:numId="9" w16cid:durableId="1171943740">
     <w:abstractNumId w:val="2"/>
   </w:num>
-  <w:num w:numId="10" w16cid:durableId="1594628622">
+  <w:num w:numId="10" w16cid:durableId="1753815165">
     <w:abstractNumId w:val="6"/>
   </w:num>
-  <w:num w:numId="11" w16cid:durableId="877935689">
+  <w:num w:numId="11" w16cid:durableId="961039624">
     <w:abstractNumId w:val="18"/>
   </w:num>
-  <w:num w:numId="12" w16cid:durableId="2083601952">
+  <w:num w:numId="12" w16cid:durableId="1731343277">
     <w:abstractNumId w:val="13"/>
   </w:num>
-  <w:num w:numId="13" w16cid:durableId="277493996">
+  <w:num w:numId="13" w16cid:durableId="548032625">
     <w:abstractNumId w:val="15"/>
   </w:num>
-  <w:num w:numId="14" w16cid:durableId="1884245052">
+  <w:num w:numId="14" w16cid:durableId="1028602596">
     <w:abstractNumId w:val="0"/>
   </w:num>
-  <w:num w:numId="15" w16cid:durableId="1317297108">
+  <w:num w:numId="15" w16cid:durableId="2050915753">
     <w:abstractNumId w:val="19"/>
   </w:num>
-  <w:num w:numId="16" w16cid:durableId="379285150">
+  <w:num w:numId="16" w16cid:durableId="448206694">
     <w:abstractNumId w:val="1"/>
   </w:num>
-  <w:num w:numId="17" w16cid:durableId="1763185956">
+  <w:num w:numId="17" w16cid:durableId="1318726053">
     <w:abstractNumId w:val="16"/>
   </w:num>
-  <w:num w:numId="18" w16cid:durableId="688483450">
+  <w:num w:numId="18" w16cid:durableId="1336881606">
     <w:abstractNumId w:val="11"/>
   </w:num>
-  <w:num w:numId="19" w16cid:durableId="1466774605">
+  <w:num w:numId="19" w16cid:durableId="746802322">
     <w:abstractNumId w:val="7"/>
   </w:num>
-  <w:num w:numId="20" w16cid:durableId="554244988">
+  <w:num w:numId="20" w16cid:durableId="1427727600">
     <w:abstractNumId w:val="17"/>
   </w:num>
 </w:numbering>
@@ -26112,7 +25375,7 @@
 </file>
 
 <file path=customXml/itemProps1.xml><?xml version="1.0" encoding="utf-8"?>
-<ds:datastoreItem xmlns:ds="http://schemas.openxmlformats.org/officeDocument/2006/customXml" ds:itemID="{AB522908-B92B-4592-8E41-8D28146AE020}">
+<ds:datastoreItem xmlns:ds="http://schemas.openxmlformats.org/officeDocument/2006/customXml" ds:itemID="{DA2D0643-97D9-49C7-B548-631528FEFABF}">
   <ds:schemaRefs>
     <ds:schemaRef ds:uri="http://schemas.openxmlformats.org/officeDocument/2006/bibliography"/>
   </ds:schemaRefs>

</xml_diff>

<commit_message>
Fix malformed 2026 schedule source entries
</commit_message>
<xml_diff>
--- a/src/Features/Integration/data/2026_sem1/zi/01.09.26/Orar_An_I Lic.docx
+++ b/src/Features/Integration/data/2026_sem1/zi/01.09.26/Orar_An_I Lic.docx
@@ -6762,7 +6762,7 @@
                 <w:szCs w:val="32"/>
                 <w:lang w:val="it-IT"/>
               </w:rPr>
-              <w:t xml:space="preserve">S e c u r i t a t e a    </w:t>
+              <w:t>Securitatea cibernetică (curs)</w:t>
             </w:r>
             <w:r>
               <w:rPr>
@@ -6770,7 +6770,6 @@
                 <w:szCs w:val="32"/>
                 <w:lang w:val="it-IT"/>
               </w:rPr>
-              <w:t>c</w:t>
             </w:r>
             <w:r>
               <w:rPr>
@@ -6778,7 +6777,6 @@
                 <w:szCs w:val="32"/>
                 <w:lang w:val="it-IT"/>
               </w:rPr>
-              <w:t xml:space="preserve"> i b e r n e t i c ă   (curs)</w:t>
             </w:r>
           </w:p>
           <w:p>
@@ -15295,7 +15293,7 @@
                 <w:szCs w:val="32"/>
                 <w:lang w:val="it-IT"/>
               </w:rPr>
-              <w:t xml:space="preserve">Securitatea  </w:t>
+              <w:t>Securitatea cibernetică (curs)</w:t>
             </w:r>
             <w:r>
               <w:rPr>
@@ -15304,7 +15302,6 @@
                 <w:szCs w:val="32"/>
                 <w:lang w:val="it-IT"/>
               </w:rPr>
-              <w:t>c</w:t>
             </w:r>
             <w:r>
               <w:rPr>
@@ -15313,7 +15310,6 @@
                 <w:szCs w:val="32"/>
                 <w:lang w:val="it-IT"/>
               </w:rPr>
-              <w:t>ibernetică (curs)</w:t>
             </w:r>
           </w:p>
           <w:p>

</xml_diff>